<commit_message>
Add resumable training with checkpointing and wall-clock budget
Training notebook:
- Save a per-epoch last_..._fold0.pth checkpoint (model, optimizer,
  scheduler, AMP scaler, epoch, best_dice) in addition to the best
  checkpoint, so an interrupted run can be resumed.
- Resume support (CFG.resume): on re-run, restore full training state
  from last and continue from the next epoch; rebuild the history CSV
  without duplicate rows.
- Predictive wall-clock guard (CFG.max_train_hours, default 11h): stop
  cleanly after an epoch when one more epoch would exceed the per-session
  budget, so the run is never killed mid-epoch by Kaggle's 12h limit.

Also includes prior uncommitted notebook work migrating the model from
EfficientNet-B0/384 to EfficientNet-B5/456 with an auxiliary classification head.

Docs synced (README.md, CLAUDE.md, technical documentation .docx) to
describe the last/resume checkpoint behavior and wall-clock budget.
</commit_message>
<xml_diff>
--- a/docs/UW_Madison_GI_Tract_Segmentation_Technical_Documentation_EN.docx
+++ b/docs/UW_Madison_GI_Tract_Segmentation_Technical_Documentation_EN.docx
@@ -1313,6 +1313,33 @@
             <w:vAlign w:val="center"/>
           </w:tcPr>
           <w:p>
+            <w:r>
+              <w:t>last_effnetb0_unet_c_order_fold0.pth</w:t>
+            </w:r>
+          </w:p>
+        </w:tc>
+        <w:tc>
+          <w:tcPr>
+            <w:tcW w:type="dxa" w:w="6192"/>
+            <w:vAlign w:val="center"/>
+          </w:tcPr>
+          <w:p>
+            <w:r>
+              <w:t>Per-epoch resume checkpoint. Stores model, optimizer, scheduler, and AMP scaler state plus epoch and best Dice, so an interrupted run can resume (CFG.resume) and a run can stay under the Kaggle 12h session limit (CFG.max_train_hours).</w:t>
+            </w:r>
+          </w:p>
+        </w:tc>
+      </w:tr>
+      <w:tr>
+        <w:trPr>
+          <w:cantSplit/>
+        </w:trPr>
+        <w:tc>
+          <w:tcPr>
+            <w:tcW w:type="dxa" w:w="4032"/>
+            <w:vAlign w:val="center"/>
+          </w:tcPr>
+          <w:p>
             <w:pPr>
               <w:spacing w:after="0"/>
               <w:jc w:val="left"/>
@@ -4560,6 +4587,20 @@
           <w:sz w:val="21"/>
         </w:rPr>
         <w:t>The notebook saves a checkpoint whenever validation Dice improves. The best checkpoint is best_effnetb0_unet_c_order_fold0.pth. The threshold-tuning notebook loads this checkpoint and reports checkpoint epoch = 16 and best Dice = 0.8832072341556161.</w:t>
+      </w:r>
+    </w:p>
+    <w:p>
+      <w:pPr>
+        <w:pStyle w:val="Heading2"/>
+      </w:pPr>
+      <w:r>
+        <w:t>5.6 Resumable Training and Wall-Clock Budget</w:t>
+      </w:r>
+    </w:p>
+    <w:p>
+      <w:pPr/>
+      <w:r>
+        <w:t>Kaggle GPU sessions are capped at a hard 12-hour limit, and in Save &amp; Run All (Commit) mode a run that reaches that wall fails and discards all /kaggle/working outputs. To make long runs safe, the training notebook also writes a per-epoch resume checkpoint last_effnetb0_unet_c_order_fold0.pth containing the model, optimizer, scheduler, and AMP scaler state plus the current epoch and best Dice. With CFG.resume = True, re-running the notebook restores this state and continues from the next epoch, and the training-history CSV is rebuilt without duplicate rows. A predictive wall-clock guard, CFG.max_train_hours (default 11.0), stops training cleanly after an epoch when one more epoch would exceed the per-session budget, so the run is never killed mid-epoch. Each session gets a fresh budget, so a run that needs more than 12 hours can finish across multiple sessions by simply re-running.</w:t>
       </w:r>
     </w:p>
     <w:tbl>

</xml_diff>

<commit_message>
Align notebooks for B5, record B5 submission, and clean up repo
EfficientNet-B5 + aux head is trained (20/20 epochs, val Dice 0.9112) and
submitted: public 0.81244 / private 0.77691, beating the B0 baseline
(0.80577 / 0.77297).

- Realign threshold-tuning and submission notebooks to the B5 setup
  (efficientnet-b5, img_size=456, use_aux_cls, forward_seg_logits to handle
  the (seg, cls) tuple output); add the submission notebook.
- Update README.md, CLAUDE.md, and the technical docx with B5 results and
  leaderboard scores.
- Add per-epoch training-history CSVs for B0 and B5 under results/.
- Stop committing model checkpoints: git-ignore models/*.pth (B5 is ~370 MB,
  over GitHub's 100 MB limit), remove the tracked B0 checkpoint, and add
  models/README.md describing the checkpoints and how to obtain them.
- Drop unused placeholder figures and the chart spreadsheet.
</commit_message>
<xml_diff>
--- a/docs/UW_Madison_GI_Tract_Segmentation_Technical_Documentation_EN.docx
+++ b/docs/UW_Madison_GI_Tract_Segmentation_Technical_Documentation_EN.docx
@@ -615,7 +615,7 @@
           <w:rFonts w:ascii="Liberation Sans" w:hAnsi="Liberation Sans" w:eastAsia="Liberation Sans"/>
           <w:sz w:val="21"/>
         </w:rPr>
-        <w:t>The final submission results shown in the competition interface are listed below. Version 3 and Version 4 produced the same leaderboard scores.</w:t>
+        <w:t>The final submission results shown in the competition interface are listed below. Version 5 (EfficientNet-B5 + auxiliary head) is the best submission; Versions 3 and 4 (EfficientNet-B0 baseline) produced the same, lower leaderboard scores.</w:t>
       </w:r>
     </w:p>
     <w:tbl>
@@ -736,18 +736,8 @@
             <w:vAlign w:val="center"/>
           </w:tcPr>
           <w:p>
-            <w:pPr>
-              <w:spacing w:after="0"/>
-              <w:jc w:val="left"/>
-            </w:pPr>
-            <w:r/>
-            <w:r>
-              <w:rPr>
-                <w:rFonts w:ascii="Liberation Sans" w:hAnsi="Liberation Sans" w:eastAsia="Liberation Sans"/>
-                <w:b w:val="0"/>
-                <w:sz w:val="18"/>
-              </w:rPr>
-              <w:t>Version 4</w:t>
+            <w:r>
+              <w:t>Version 5</w:t>
             </w:r>
           </w:p>
         </w:tc>
@@ -757,18 +747,8 @@
             <w:vAlign w:val="center"/>
           </w:tcPr>
           <w:p>
-            <w:pPr>
-              <w:spacing w:after="0"/>
-              <w:jc w:val="left"/>
-            </w:pPr>
-            <w:r/>
-            <w:r>
-              <w:rPr>
-                <w:rFonts w:ascii="Liberation Sans" w:hAnsi="Liberation Sans" w:eastAsia="Liberation Sans"/>
-                <w:b w:val="0"/>
-                <w:sz w:val="18"/>
-              </w:rPr>
-              <w:t>0.80577</w:t>
+            <w:r>
+              <w:t>0.81244</w:t>
             </w:r>
           </w:p>
         </w:tc>
@@ -778,18 +758,8 @@
             <w:vAlign w:val="center"/>
           </w:tcPr>
           <w:p>
-            <w:pPr>
-              <w:spacing w:after="0"/>
-              <w:jc w:val="left"/>
-            </w:pPr>
-            <w:r/>
-            <w:r>
-              <w:rPr>
-                <w:rFonts w:ascii="Liberation Sans" w:hAnsi="Liberation Sans" w:eastAsia="Liberation Sans"/>
-                <w:b w:val="0"/>
-                <w:sz w:val="18"/>
-              </w:rPr>
-              <w:t>0.77297</w:t>
+            <w:r>
+              <w:t>0.77691</w:t>
             </w:r>
           </w:p>
         </w:tc>
@@ -799,17 +769,7 @@
             <w:vAlign w:val="center"/>
           </w:tcPr>
           <w:p>
-            <w:pPr>
-              <w:spacing w:after="0"/>
-              <w:jc w:val="left"/>
-            </w:pPr>
-            <w:r/>
-            <w:r>
-              <w:rPr>
-                <w:rFonts w:ascii="Liberation Sans" w:hAnsi="Liberation Sans" w:eastAsia="Liberation Sans"/>
-                <w:b w:val="0"/>
-                <w:sz w:val="18"/>
-              </w:rPr>
+            <w:r>
               <w:t>Succeeded after deadline</w:t>
             </w:r>
           </w:p>
@@ -825,17 +785,52 @@
             <w:vAlign w:val="center"/>
           </w:tcPr>
           <w:p>
-            <w:pPr>
-              <w:spacing w:after="0"/>
-              <w:jc w:val="left"/>
-            </w:pPr>
-            <w:r/>
-            <w:r>
-              <w:rPr>
-                <w:rFonts w:ascii="Liberation Sans" w:hAnsi="Liberation Sans" w:eastAsia="Liberation Sans"/>
-                <w:b w:val="0"/>
-                <w:sz w:val="18"/>
-              </w:rPr>
+            <w:r>
+              <w:t>Version 4</w:t>
+            </w:r>
+          </w:p>
+        </w:tc>
+        <w:tc>
+          <w:tcPr>
+            <w:tcW w:type="dxa" w:w="2556"/>
+            <w:vAlign w:val="center"/>
+          </w:tcPr>
+          <w:p>
+            <w:r>
+              <w:t>0.80577</w:t>
+            </w:r>
+          </w:p>
+        </w:tc>
+        <w:tc>
+          <w:tcPr>
+            <w:tcW w:type="dxa" w:w="2556"/>
+            <w:vAlign w:val="center"/>
+          </w:tcPr>
+          <w:p>
+            <w:r>
+              <w:t>0.77297</w:t>
+            </w:r>
+          </w:p>
+        </w:tc>
+        <w:tc>
+          <w:tcPr>
+            <w:tcW w:type="dxa" w:w="2556"/>
+            <w:vAlign w:val="center"/>
+          </w:tcPr>
+          <w:p>
+            <w:r>
+              <w:t>Succeeded after deadline</w:t>
+            </w:r>
+          </w:p>
+        </w:tc>
+      </w:tr>
+      <w:tr>
+        <w:tc>
+          <w:tcPr>
+            <w:tcW w:type="dxa" w:w="2556"/>
+          </w:tcPr>
+          <w:p>
+            <w:r>
               <w:t>Version 3</w:t>
             </w:r>
           </w:p>
@@ -843,20 +838,9 @@
         <w:tc>
           <w:tcPr>
             <w:tcW w:type="dxa" w:w="2556"/>
-            <w:vAlign w:val="center"/>
-          </w:tcPr>
-          <w:p>
-            <w:pPr>
-              <w:spacing w:after="0"/>
-              <w:jc w:val="left"/>
-            </w:pPr>
-            <w:r/>
-            <w:r>
-              <w:rPr>
-                <w:rFonts w:ascii="Liberation Sans" w:hAnsi="Liberation Sans" w:eastAsia="Liberation Sans"/>
-                <w:b w:val="0"/>
-                <w:sz w:val="18"/>
-              </w:rPr>
+          </w:tcPr>
+          <w:p>
+            <w:r>
               <w:t>0.80577</w:t>
             </w:r>
           </w:p>
@@ -864,20 +848,9 @@
         <w:tc>
           <w:tcPr>
             <w:tcW w:type="dxa" w:w="2556"/>
-            <w:vAlign w:val="center"/>
-          </w:tcPr>
-          <w:p>
-            <w:pPr>
-              <w:spacing w:after="0"/>
-              <w:jc w:val="left"/>
-            </w:pPr>
-            <w:r/>
-            <w:r>
-              <w:rPr>
-                <w:rFonts w:ascii="Liberation Sans" w:hAnsi="Liberation Sans" w:eastAsia="Liberation Sans"/>
-                <w:b w:val="0"/>
-                <w:sz w:val="18"/>
-              </w:rPr>
+          </w:tcPr>
+          <w:p>
+            <w:r>
               <w:t>0.77297</w:t>
             </w:r>
           </w:p>
@@ -885,20 +858,9 @@
         <w:tc>
           <w:tcPr>
             <w:tcW w:type="dxa" w:w="2556"/>
-            <w:vAlign w:val="center"/>
-          </w:tcPr>
-          <w:p>
-            <w:pPr>
-              <w:spacing w:after="0"/>
-              <w:jc w:val="left"/>
-            </w:pPr>
-            <w:r/>
-            <w:r>
-              <w:rPr>
-                <w:rFonts w:ascii="Liberation Sans" w:hAnsi="Liberation Sans" w:eastAsia="Liberation Sans"/>
-                <w:b w:val="0"/>
-                <w:sz w:val="18"/>
-              </w:rPr>
+          </w:tcPr>
+          <w:p>
+            <w:r>
               <w:t>Succeeded after deadline</w:t>
             </w:r>
           </w:p>
@@ -11402,6 +11364,2741 @@
       </w:tr>
     </w:tbl>
     <w:p/>
+    <w:p>
+      <w:pPr>
+        <w:pStyle w:val="Heading1"/>
+      </w:pPr>
+      <w:r>
+        <w:t>Appendix B. EfficientNet-B5 Experiment (Submitted - Best Result)</w:t>
+      </w:r>
+    </w:p>
+    <w:p>
+      <w:r>
+        <w:t>After the EfficientNet-B0 baseline described above, a higher-capacity variant was trained to push validation Dice further. It is now trained and submitted, and it is the best result so far: Public 0.81244 / Private 0.77691, versus the B0 baseline's 0.80577 / 0.77297. The text below records the configuration changes and results.</w:t>
+      </w:r>
+    </w:p>
+    <w:p>
+      <w:pPr>
+        <w:pStyle w:val="Heading2"/>
+      </w:pPr>
+      <w:r>
+        <w:t>B.1 Changes versus the B0 baseline</w:t>
+      </w:r>
+    </w:p>
+    <w:tbl>
+      <w:tblPr>
+        <w:tblStyle w:val="TableGrid"/>
+        <w:tblW w:type="auto" w:w="0"/>
+        <w:tblLook w:firstColumn="1" w:firstRow="1" w:lastColumn="0" w:lastRow="0" w:noHBand="0" w:noVBand="1" w:val="04A0"/>
+      </w:tblPr>
+      <w:tblGrid>
+        <w:gridCol w:w="4752"/>
+        <w:gridCol w:w="4752"/>
+        <w:gridCol w:w="4752"/>
+      </w:tblGrid>
+      <w:tr>
+        <w:tc>
+          <w:tcPr>
+            <w:tcW w:type="dxa" w:w="4752"/>
+          </w:tcPr>
+          <w:p>
+            <w:r>
+              <w:t>Aspect</w:t>
+            </w:r>
+          </w:p>
+        </w:tc>
+        <w:tc>
+          <w:tcPr>
+            <w:tcW w:type="dxa" w:w="4752"/>
+          </w:tcPr>
+          <w:p>
+            <w:r>
+              <w:t>B0 baseline (submitted)</w:t>
+            </w:r>
+          </w:p>
+        </w:tc>
+        <w:tc>
+          <w:tcPr>
+            <w:tcW w:type="dxa" w:w="4752"/>
+          </w:tcPr>
+          <w:p>
+            <w:r>
+              <w:t>B5 experiment</w:t>
+            </w:r>
+          </w:p>
+        </w:tc>
+      </w:tr>
+      <w:tr>
+        <w:tc>
+          <w:tcPr>
+            <w:tcW w:type="dxa" w:w="4752"/>
+          </w:tcPr>
+          <w:p>
+            <w:r>
+              <w:t>Encoder</w:t>
+            </w:r>
+          </w:p>
+        </w:tc>
+        <w:tc>
+          <w:tcPr>
+            <w:tcW w:type="dxa" w:w="4752"/>
+          </w:tcPr>
+          <w:p>
+            <w:r>
+              <w:t>EfficientNet-B0</w:t>
+            </w:r>
+          </w:p>
+        </w:tc>
+        <w:tc>
+          <w:tcPr>
+            <w:tcW w:type="dxa" w:w="4752"/>
+          </w:tcPr>
+          <w:p>
+            <w:r>
+              <w:t>EfficientNet-B5</w:t>
+            </w:r>
+          </w:p>
+        </w:tc>
+      </w:tr>
+      <w:tr>
+        <w:tc>
+          <w:tcPr>
+            <w:tcW w:type="dxa" w:w="4752"/>
+          </w:tcPr>
+          <w:p>
+            <w:r>
+              <w:t>Image size</w:t>
+            </w:r>
+          </w:p>
+        </w:tc>
+        <w:tc>
+          <w:tcPr>
+            <w:tcW w:type="dxa" w:w="4752"/>
+          </w:tcPr>
+          <w:p>
+            <w:r>
+              <w:t>384 x 384</w:t>
+            </w:r>
+          </w:p>
+        </w:tc>
+        <w:tc>
+          <w:tcPr>
+            <w:tcW w:type="dxa" w:w="4752"/>
+          </w:tcPr>
+          <w:p>
+            <w:r>
+              <w:t>456 x 456 (B5 native resolution)</w:t>
+            </w:r>
+          </w:p>
+        </w:tc>
+      </w:tr>
+      <w:tr>
+        <w:tc>
+          <w:tcPr>
+            <w:tcW w:type="dxa" w:w="4752"/>
+          </w:tcPr>
+          <w:p>
+            <w:r>
+              <w:t>Batch</w:t>
+            </w:r>
+          </w:p>
+        </w:tc>
+        <w:tc>
+          <w:tcPr>
+            <w:tcW w:type="dxa" w:w="4752"/>
+          </w:tcPr>
+          <w:p>
+            <w:r>
+              <w:t>8</w:t>
+            </w:r>
+          </w:p>
+        </w:tc>
+        <w:tc>
+          <w:tcPr>
+            <w:tcW w:type="dxa" w:w="4752"/>
+          </w:tcPr>
+          <w:p>
+            <w:r>
+              <w:t>2 x 4 gradient accumulation (effective 8)</w:t>
+            </w:r>
+          </w:p>
+        </w:tc>
+      </w:tr>
+      <w:tr>
+        <w:tc>
+          <w:tcPr>
+            <w:tcW w:type="dxa" w:w="4752"/>
+          </w:tcPr>
+          <w:p>
+            <w:r>
+              <w:t>Auxiliary classification head</w:t>
+            </w:r>
+          </w:p>
+        </w:tc>
+        <w:tc>
+          <w:tcPr>
+            <w:tcW w:type="dxa" w:w="4752"/>
+          </w:tcPr>
+          <w:p>
+            <w:r>
+              <w:t>None</w:t>
+            </w:r>
+          </w:p>
+        </w:tc>
+        <w:tc>
+          <w:tcPr>
+            <w:tcW w:type="dxa" w:w="4752"/>
+          </w:tcPr>
+          <w:p>
+            <w:r>
+              <w:t>Enabled (one presence logit per organ)</w:t>
+            </w:r>
+          </w:p>
+        </w:tc>
+      </w:tr>
+      <w:tr>
+        <w:tc>
+          <w:tcPr>
+            <w:tcW w:type="dxa" w:w="4752"/>
+          </w:tcPr>
+          <w:p>
+            <w:r>
+              <w:t>Loss</w:t>
+            </w:r>
+          </w:p>
+        </w:tc>
+        <w:tc>
+          <w:tcPr>
+            <w:tcW w:type="dxa" w:w="4752"/>
+          </w:tcPr>
+          <w:p>
+            <w:r>
+              <w:t>BCE + 3 x Dice</w:t>
+            </w:r>
+          </w:p>
+        </w:tc>
+        <w:tc>
+          <w:tcPr>
+            <w:tcW w:type="dxa" w:w="4752"/>
+          </w:tcPr>
+          <w:p>
+            <w:r>
+              <w:t>BCE + 3 x Dice + 0.3 x BCE (organ presence)</w:t>
+            </w:r>
+          </w:p>
+        </w:tc>
+      </w:tr>
+    </w:tbl>
+    <w:p>
+      <w:r>
+        <w:t>The auxiliary classification head shares the EfficientNet encoder with the U-Net decoder and is added through smp.Unet(aux_params=...). With it enabled the model returns a tuple (seg_logits, cls_logits) instead of a single segmentation tensor. The presence targets are derived from the masks (a class is present if its mask channel has any positive pixel), and the classification BCE is added to the total loss with weight 0.3. Gradient accumulation keeps the per-step memory peak small (batch_size = 2) so EfficientNet-B5 at 456 fits on a 16 GB GPU while preserving an effective batch size of 8 (accum_steps = 4).</w:t>
+      </w:r>
+    </w:p>
+    <w:p>
+      <w:pPr>
+        <w:pStyle w:val="Heading2"/>
+      </w:pPr>
+      <w:r>
+        <w:t>B.2 Validation results so far</w:t>
+      </w:r>
+    </w:p>
+    <w:p>
+      <w:r>
+        <w:t>Training ran the full 20 of 20 epochs (completed across multiple Kaggle sessions via the resume / wall-clock mechanism). The cosine schedule fully annealed to its minimum (final learning rate = eta_min 1e-6), so the run has converged: validation Dice over the last ~7 epochs moved only within noise (&lt;=0.0003) and the best score landed on the final epoch. The table below compares the best validation Dice and the leaderboard scores of the two models.</w:t>
+      </w:r>
+    </w:p>
+    <w:tbl>
+      <w:tblPr>
+        <w:tblStyle w:val="TableGrid"/>
+        <w:tblW w:type="auto" w:w="0"/>
+        <w:tblLook w:firstColumn="1" w:firstRow="1" w:lastColumn="0" w:lastRow="0" w:noHBand="0" w:noVBand="1" w:val="04A0"/>
+      </w:tblPr>
+      <w:tblGrid>
+        <w:gridCol w:w="4752"/>
+        <w:gridCol w:w="4752"/>
+        <w:gridCol w:w="4752"/>
+      </w:tblGrid>
+      <w:tr>
+        <w:tc>
+          <w:tcPr>
+            <w:tcW w:type="dxa" w:w="4752"/>
+          </w:tcPr>
+          <w:p>
+            <w:r>
+              <w:t>Metric</w:t>
+            </w:r>
+          </w:p>
+        </w:tc>
+        <w:tc>
+          <w:tcPr>
+            <w:tcW w:type="dxa" w:w="4752"/>
+          </w:tcPr>
+          <w:p>
+            <w:r>
+              <w:t>B0 baseline</w:t>
+            </w:r>
+          </w:p>
+        </w:tc>
+        <w:tc>
+          <w:tcPr>
+            <w:tcW w:type="dxa" w:w="4752"/>
+          </w:tcPr>
+          <w:p>
+            <w:r>
+              <w:t>B5 experiment</w:t>
+            </w:r>
+          </w:p>
+        </w:tc>
+      </w:tr>
+      <w:tr>
+        <w:tc>
+          <w:tcPr>
+            <w:tcW w:type="dxa" w:w="4752"/>
+          </w:tcPr>
+          <w:p>
+            <w:r>
+              <w:t>Best epoch</w:t>
+            </w:r>
+          </w:p>
+        </w:tc>
+        <w:tc>
+          <w:tcPr>
+            <w:tcW w:type="dxa" w:w="4752"/>
+          </w:tcPr>
+          <w:p>
+            <w:r>
+              <w:t>16 (of 20, finished)</w:t>
+            </w:r>
+          </w:p>
+        </w:tc>
+        <w:tc>
+          <w:tcPr>
+            <w:tcW w:type="dxa" w:w="4752"/>
+          </w:tcPr>
+          <w:p>
+            <w:r>
+              <w:t>20 (of 20, finished)</w:t>
+            </w:r>
+          </w:p>
+        </w:tc>
+      </w:tr>
+      <w:tr>
+        <w:tc>
+          <w:tcPr>
+            <w:tcW w:type="dxa" w:w="4752"/>
+          </w:tcPr>
+          <w:p>
+            <w:r>
+              <w:t>Best validation Dice</w:t>
+            </w:r>
+          </w:p>
+        </w:tc>
+        <w:tc>
+          <w:tcPr>
+            <w:tcW w:type="dxa" w:w="4752"/>
+          </w:tcPr>
+          <w:p>
+            <w:r>
+              <w:t>0.8832</w:t>
+            </w:r>
+          </w:p>
+        </w:tc>
+        <w:tc>
+          <w:tcPr>
+            <w:tcW w:type="dxa" w:w="4752"/>
+          </w:tcPr>
+          <w:p>
+            <w:r>
+              <w:t>0.9112</w:t>
+            </w:r>
+          </w:p>
+        </w:tc>
+      </w:tr>
+      <w:tr>
+        <w:tc>
+          <w:tcPr>
+            <w:tcW w:type="dxa" w:w="4752"/>
+          </w:tcPr>
+          <w:p>
+            <w:r>
+              <w:t>Large bowel Dice</w:t>
+            </w:r>
+          </w:p>
+        </w:tc>
+        <w:tc>
+          <w:tcPr>
+            <w:tcW w:type="dxa" w:w="4752"/>
+          </w:tcPr>
+          <w:p>
+            <w:r>
+              <w:t>0.8723</w:t>
+            </w:r>
+          </w:p>
+        </w:tc>
+        <w:tc>
+          <w:tcPr>
+            <w:tcW w:type="dxa" w:w="4752"/>
+          </w:tcPr>
+          <w:p>
+            <w:r>
+              <w:t>0.9015</w:t>
+            </w:r>
+          </w:p>
+        </w:tc>
+      </w:tr>
+      <w:tr>
+        <w:tc>
+          <w:tcPr>
+            <w:tcW w:type="dxa" w:w="4752"/>
+          </w:tcPr>
+          <w:p>
+            <w:r>
+              <w:t>Small bowel Dice</w:t>
+            </w:r>
+          </w:p>
+        </w:tc>
+        <w:tc>
+          <w:tcPr>
+            <w:tcW w:type="dxa" w:w="4752"/>
+          </w:tcPr>
+          <w:p>
+            <w:r>
+              <w:t>0.8447</w:t>
+            </w:r>
+          </w:p>
+        </w:tc>
+        <w:tc>
+          <w:tcPr>
+            <w:tcW w:type="dxa" w:w="4752"/>
+          </w:tcPr>
+          <w:p>
+            <w:r>
+              <w:t>0.8828</w:t>
+            </w:r>
+          </w:p>
+        </w:tc>
+      </w:tr>
+      <w:tr>
+        <w:tc>
+          <w:tcPr>
+            <w:tcW w:type="dxa" w:w="4752"/>
+          </w:tcPr>
+          <w:p>
+            <w:r>
+              <w:t>Stomach Dice</w:t>
+            </w:r>
+          </w:p>
+        </w:tc>
+        <w:tc>
+          <w:tcPr>
+            <w:tcW w:type="dxa" w:w="4752"/>
+          </w:tcPr>
+          <w:p>
+            <w:r>
+              <w:t>0.9326</w:t>
+            </w:r>
+          </w:p>
+        </w:tc>
+        <w:tc>
+          <w:tcPr>
+            <w:tcW w:type="dxa" w:w="4752"/>
+          </w:tcPr>
+          <w:p>
+            <w:r>
+              <w:t>0.9494</w:t>
+            </w:r>
+          </w:p>
+        </w:tc>
+      </w:tr>
+      <w:tr>
+        <w:tc>
+          <w:tcPr>
+            <w:tcW w:type="dxa" w:w="4752"/>
+          </w:tcPr>
+          <w:p>
+            <w:r>
+              <w:t>Time per epoch</w:t>
+            </w:r>
+          </w:p>
+        </w:tc>
+        <w:tc>
+          <w:tcPr>
+            <w:tcW w:type="dxa" w:w="4752"/>
+          </w:tcPr>
+          <w:p>
+            <w:r>
+              <w:t>~12 min</w:t>
+            </w:r>
+          </w:p>
+        </w:tc>
+        <w:tc>
+          <w:tcPr>
+            <w:tcW w:type="dxa" w:w="4752"/>
+          </w:tcPr>
+          <w:p>
+            <w:r>
+              <w:t>~42 min</w:t>
+            </w:r>
+          </w:p>
+        </w:tc>
+      </w:tr>
+      <w:tr>
+        <w:tc>
+          <w:tcPr>
+            <w:tcW w:type="dxa" w:w="4752"/>
+          </w:tcPr>
+          <w:p>
+            <w:r>
+              <w:t>Public LB</w:t>
+            </w:r>
+          </w:p>
+        </w:tc>
+        <w:tc>
+          <w:tcPr>
+            <w:tcW w:type="dxa" w:w="4752"/>
+          </w:tcPr>
+          <w:p>
+            <w:r>
+              <w:t>0.80577</w:t>
+            </w:r>
+          </w:p>
+        </w:tc>
+        <w:tc>
+          <w:tcPr>
+            <w:tcW w:type="dxa" w:w="4752"/>
+          </w:tcPr>
+          <w:p>
+            <w:r>
+              <w:t>0.81244</w:t>
+            </w:r>
+          </w:p>
+        </w:tc>
+      </w:tr>
+      <w:tr>
+        <w:tc>
+          <w:tcPr>
+            <w:tcW w:type="dxa" w:w="4752"/>
+          </w:tcPr>
+          <w:p>
+            <w:r>
+              <w:t>Private LB</w:t>
+            </w:r>
+          </w:p>
+        </w:tc>
+        <w:tc>
+          <w:tcPr>
+            <w:tcW w:type="dxa" w:w="4752"/>
+          </w:tcPr>
+          <w:p>
+            <w:r>
+              <w:t>0.77297</w:t>
+            </w:r>
+          </w:p>
+        </w:tc>
+        <w:tc>
+          <w:tcPr>
+            <w:tcW w:type="dxa" w:w="4752"/>
+          </w:tcPr>
+          <w:p>
+            <w:r>
+              <w:t>0.77691</w:t>
+            </w:r>
+          </w:p>
+        </w:tc>
+      </w:tr>
+    </w:tbl>
+    <w:p>
+      <w:r>
+        <w:t>The B5 run improves validation Dice by roughly 2.8 percentage points over B0 across all three organs, with the largest gain on the hardest class (small bowel). This local gain carried over to the leaderboard (+0.0067 public / +0.0039 private), confirming the improvement was real and not overfit to fold 0.</w:t>
+      </w:r>
+    </w:p>
+    <w:p>
+      <w:pPr>
+        <w:pStyle w:val="Heading2"/>
+      </w:pPr>
+      <w:r>
+        <w:t>B.3 How the B5 submission was produced</w:t>
+      </w:r>
+    </w:p>
+    <w:p>
+      <w:r>
+        <w:t>The threshold-tuning and submission notebooks were realigned to the B5 setup: encoder_name = efficientnet-b5, img_size = 456, use_aux_cls = True, plus a forward_seg_logits helper that builds smp.Unet(aux_params=...) and takes the segmentation logits from the (seg_logits, cls_logits) tuple. The threshold-tuning notebook was re-run on the B5 checkpoint to produce B5-specific per-class thresholds (the B0 values 0.39 / 0.59 / 0.33 are not optimal for B5), which the submission notebook loads via thresholds_json_path. Running the submission notebook then produced the Public 0.81244 / Private 0.77691 result.</w:t>
+      </w:r>
+    </w:p>
+    <w:p>
+      <w:pPr>
+        <w:pStyle w:val="Heading2"/>
+      </w:pPr>
+      <w:r>
+        <w:t>B.4 Epoch-level B5 training history (epochs 1-20)</w:t>
+      </w:r>
+    </w:p>
+    <w:tbl>
+      <w:tblPr>
+        <w:tblStyle w:val="TableGrid"/>
+        <w:tblW w:type="auto" w:w="0"/>
+        <w:tblLook w:firstColumn="1" w:firstRow="1" w:lastColumn="0" w:lastRow="0" w:noHBand="0" w:noVBand="1" w:val="04A0"/>
+      </w:tblPr>
+      <w:tblGrid>
+        <w:gridCol w:w="1426"/>
+        <w:gridCol w:w="1426"/>
+        <w:gridCol w:w="1426"/>
+        <w:gridCol w:w="1426"/>
+        <w:gridCol w:w="1426"/>
+        <w:gridCol w:w="1426"/>
+        <w:gridCol w:w="1426"/>
+        <w:gridCol w:w="1426"/>
+        <w:gridCol w:w="1426"/>
+        <w:gridCol w:w="1426"/>
+      </w:tblGrid>
+      <w:tr>
+        <w:tc>
+          <w:tcPr>
+            <w:tcW w:type="dxa" w:w="1426"/>
+          </w:tcPr>
+          <w:p>
+            <w:r>
+              <w:t>Epoch</w:t>
+            </w:r>
+          </w:p>
+        </w:tc>
+        <w:tc>
+          <w:tcPr>
+            <w:tcW w:type="dxa" w:w="1426"/>
+          </w:tcPr>
+          <w:p>
+            <w:r>
+              <w:t>LR</w:t>
+            </w:r>
+          </w:p>
+        </w:tc>
+        <w:tc>
+          <w:tcPr>
+            <w:tcW w:type="dxa" w:w="1426"/>
+          </w:tcPr>
+          <w:p>
+            <w:r>
+              <w:t>Train Loss</w:t>
+            </w:r>
+          </w:p>
+        </w:tc>
+        <w:tc>
+          <w:tcPr>
+            <w:tcW w:type="dxa" w:w="1426"/>
+          </w:tcPr>
+          <w:p>
+            <w:r>
+              <w:t>Train Dice</w:t>
+            </w:r>
+          </w:p>
+        </w:tc>
+        <w:tc>
+          <w:tcPr>
+            <w:tcW w:type="dxa" w:w="1426"/>
+          </w:tcPr>
+          <w:p>
+            <w:r>
+              <w:t>Valid Loss</w:t>
+            </w:r>
+          </w:p>
+        </w:tc>
+        <w:tc>
+          <w:tcPr>
+            <w:tcW w:type="dxa" w:w="1426"/>
+          </w:tcPr>
+          <w:p>
+            <w:r>
+              <w:t>Valid Dice</w:t>
+            </w:r>
+          </w:p>
+        </w:tc>
+        <w:tc>
+          <w:tcPr>
+            <w:tcW w:type="dxa" w:w="1426"/>
+          </w:tcPr>
+          <w:p>
+            <w:r>
+              <w:t>Large Dice</w:t>
+            </w:r>
+          </w:p>
+        </w:tc>
+        <w:tc>
+          <w:tcPr>
+            <w:tcW w:type="dxa" w:w="1426"/>
+          </w:tcPr>
+          <w:p>
+            <w:r>
+              <w:t>Small Dice</w:t>
+            </w:r>
+          </w:p>
+        </w:tc>
+        <w:tc>
+          <w:tcPr>
+            <w:tcW w:type="dxa" w:w="1426"/>
+          </w:tcPr>
+          <w:p>
+            <w:r>
+              <w:t>Stomach Dice</w:t>
+            </w:r>
+          </w:p>
+        </w:tc>
+        <w:tc>
+          <w:tcPr>
+            <w:tcW w:type="dxa" w:w="1426"/>
+          </w:tcPr>
+          <w:p>
+            <w:r>
+              <w:t>Time sec</w:t>
+            </w:r>
+          </w:p>
+        </w:tc>
+      </w:tr>
+      <w:tr>
+        <w:tc>
+          <w:tcPr>
+            <w:tcW w:type="dxa" w:w="1426"/>
+          </w:tcPr>
+          <w:p>
+            <w:r>
+              <w:t>1</w:t>
+            </w:r>
+          </w:p>
+        </w:tc>
+        <w:tc>
+          <w:tcPr>
+            <w:tcW w:type="dxa" w:w="1426"/>
+          </w:tcPr>
+          <w:p>
+            <w:r>
+              <w:t>9.94e-05</w:t>
+            </w:r>
+          </w:p>
+        </w:tc>
+        <w:tc>
+          <w:tcPr>
+            <w:tcW w:type="dxa" w:w="1426"/>
+          </w:tcPr>
+          <w:p>
+            <w:r>
+              <w:t>0.9306</w:t>
+            </w:r>
+          </w:p>
+        </w:tc>
+        <w:tc>
+          <w:tcPr>
+            <w:tcW w:type="dxa" w:w="1426"/>
+          </w:tcPr>
+          <w:p>
+            <w:r>
+              <w:t>0.3945</w:t>
+            </w:r>
+          </w:p>
+        </w:tc>
+        <w:tc>
+          <w:tcPr>
+            <w:tcW w:type="dxa" w:w="1426"/>
+          </w:tcPr>
+          <w:p>
+            <w:r>
+              <w:t>0.3084</w:t>
+            </w:r>
+          </w:p>
+        </w:tc>
+        <w:tc>
+          <w:tcPr>
+            <w:tcW w:type="dxa" w:w="1426"/>
+          </w:tcPr>
+          <w:p>
+            <w:r>
+              <w:t>0.8636</w:t>
+            </w:r>
+          </w:p>
+        </w:tc>
+        <w:tc>
+          <w:tcPr>
+            <w:tcW w:type="dxa" w:w="1426"/>
+          </w:tcPr>
+          <w:p>
+            <w:r>
+              <w:t>0.8532</w:t>
+            </w:r>
+          </w:p>
+        </w:tc>
+        <w:tc>
+          <w:tcPr>
+            <w:tcW w:type="dxa" w:w="1426"/>
+          </w:tcPr>
+          <w:p>
+            <w:r>
+              <w:t>0.8097</w:t>
+            </w:r>
+          </w:p>
+        </w:tc>
+        <w:tc>
+          <w:tcPr>
+            <w:tcW w:type="dxa" w:w="1426"/>
+          </w:tcPr>
+          <w:p>
+            <w:r>
+              <w:t>0.9278</w:t>
+            </w:r>
+          </w:p>
+        </w:tc>
+        <w:tc>
+          <w:tcPr>
+            <w:tcW w:type="dxa" w:w="1426"/>
+          </w:tcPr>
+          <w:p>
+            <w:r>
+              <w:t>2521.2</w:t>
+            </w:r>
+          </w:p>
+        </w:tc>
+      </w:tr>
+      <w:tr>
+        <w:tc>
+          <w:tcPr>
+            <w:tcW w:type="dxa" w:w="1426"/>
+          </w:tcPr>
+          <w:p>
+            <w:r>
+              <w:t>2</w:t>
+            </w:r>
+          </w:p>
+        </w:tc>
+        <w:tc>
+          <w:tcPr>
+            <w:tcW w:type="dxa" w:w="1426"/>
+          </w:tcPr>
+          <w:p>
+            <w:r>
+              <w:t>9.76e-05</w:t>
+            </w:r>
+          </w:p>
+        </w:tc>
+        <w:tc>
+          <w:tcPr>
+            <w:tcW w:type="dxa" w:w="1426"/>
+          </w:tcPr>
+          <w:p>
+            <w:r>
+              <w:t>0.4102</w:t>
+            </w:r>
+          </w:p>
+        </w:tc>
+        <w:tc>
+          <w:tcPr>
+            <w:tcW w:type="dxa" w:w="1426"/>
+          </w:tcPr>
+          <w:p>
+            <w:r>
+              <w:t>0.7419</w:t>
+            </w:r>
+          </w:p>
+        </w:tc>
+        <w:tc>
+          <w:tcPr>
+            <w:tcW w:type="dxa" w:w="1426"/>
+          </w:tcPr>
+          <w:p>
+            <w:r>
+              <w:t>0.2924</w:t>
+            </w:r>
+          </w:p>
+        </w:tc>
+        <w:tc>
+          <w:tcPr>
+            <w:tcW w:type="dxa" w:w="1426"/>
+          </w:tcPr>
+          <w:p>
+            <w:r>
+              <w:t>0.7871</w:t>
+            </w:r>
+          </w:p>
+        </w:tc>
+        <w:tc>
+          <w:tcPr>
+            <w:tcW w:type="dxa" w:w="1426"/>
+          </w:tcPr>
+          <w:p>
+            <w:r>
+              <w:t>0.8653</w:t>
+            </w:r>
+          </w:p>
+        </w:tc>
+        <w:tc>
+          <w:tcPr>
+            <w:tcW w:type="dxa" w:w="1426"/>
+          </w:tcPr>
+          <w:p>
+            <w:r>
+              <w:t>0.7661</w:t>
+            </w:r>
+          </w:p>
+        </w:tc>
+        <w:tc>
+          <w:tcPr>
+            <w:tcW w:type="dxa" w:w="1426"/>
+          </w:tcPr>
+          <w:p>
+            <w:r>
+              <w:t>0.7299</w:t>
+            </w:r>
+          </w:p>
+        </w:tc>
+        <w:tc>
+          <w:tcPr>
+            <w:tcW w:type="dxa" w:w="1426"/>
+          </w:tcPr>
+          <w:p>
+            <w:r>
+              <w:t>2527.2</w:t>
+            </w:r>
+          </w:p>
+        </w:tc>
+      </w:tr>
+      <w:tr>
+        <w:tc>
+          <w:tcPr>
+            <w:tcW w:type="dxa" w:w="1426"/>
+          </w:tcPr>
+          <w:p>
+            <w:r>
+              <w:t>3</w:t>
+            </w:r>
+          </w:p>
+        </w:tc>
+        <w:tc>
+          <w:tcPr>
+            <w:tcW w:type="dxa" w:w="1426"/>
+          </w:tcPr>
+          <w:p>
+            <w:r>
+              <w:t>9.46e-05</w:t>
+            </w:r>
+          </w:p>
+        </w:tc>
+        <w:tc>
+          <w:tcPr>
+            <w:tcW w:type="dxa" w:w="1426"/>
+          </w:tcPr>
+          <w:p>
+            <w:r>
+              <w:t>0.3633</w:t>
+            </w:r>
+          </w:p>
+        </w:tc>
+        <w:tc>
+          <w:tcPr>
+            <w:tcW w:type="dxa" w:w="1426"/>
+          </w:tcPr>
+          <w:p>
+            <w:r>
+              <w:t>0.7912</w:t>
+            </w:r>
+          </w:p>
+        </w:tc>
+        <w:tc>
+          <w:tcPr>
+            <w:tcW w:type="dxa" w:w="1426"/>
+          </w:tcPr>
+          <w:p>
+            <w:r>
+              <w:t>0.2606</w:t>
+            </w:r>
+          </w:p>
+        </w:tc>
+        <w:tc>
+          <w:tcPr>
+            <w:tcW w:type="dxa" w:w="1426"/>
+          </w:tcPr>
+          <w:p>
+            <w:r>
+              <w:t>0.851</w:t>
+            </w:r>
+          </w:p>
+        </w:tc>
+        <w:tc>
+          <w:tcPr>
+            <w:tcW w:type="dxa" w:w="1426"/>
+          </w:tcPr>
+          <w:p>
+            <w:r>
+              <w:t>0.8694</w:t>
+            </w:r>
+          </w:p>
+        </w:tc>
+        <w:tc>
+          <w:tcPr>
+            <w:tcW w:type="dxa" w:w="1426"/>
+          </w:tcPr>
+          <w:p>
+            <w:r>
+              <w:t>0.7928</w:t>
+            </w:r>
+          </w:p>
+        </w:tc>
+        <w:tc>
+          <w:tcPr>
+            <w:tcW w:type="dxa" w:w="1426"/>
+          </w:tcPr>
+          <w:p>
+            <w:r>
+              <w:t>0.8906</w:t>
+            </w:r>
+          </w:p>
+        </w:tc>
+        <w:tc>
+          <w:tcPr>
+            <w:tcW w:type="dxa" w:w="1426"/>
+          </w:tcPr>
+          <w:p>
+            <w:r>
+              <w:t>2541.9</w:t>
+            </w:r>
+          </w:p>
+        </w:tc>
+      </w:tr>
+      <w:tr>
+        <w:tc>
+          <w:tcPr>
+            <w:tcW w:type="dxa" w:w="1426"/>
+          </w:tcPr>
+          <w:p>
+            <w:r>
+              <w:t>4</w:t>
+            </w:r>
+          </w:p>
+        </w:tc>
+        <w:tc>
+          <w:tcPr>
+            <w:tcW w:type="dxa" w:w="1426"/>
+          </w:tcPr>
+          <w:p>
+            <w:r>
+              <w:t>9.05e-05</w:t>
+            </w:r>
+          </w:p>
+        </w:tc>
+        <w:tc>
+          <w:tcPr>
+            <w:tcW w:type="dxa" w:w="1426"/>
+          </w:tcPr>
+          <w:p>
+            <w:r>
+              <w:t>0.337</w:t>
+            </w:r>
+          </w:p>
+        </w:tc>
+        <w:tc>
+          <w:tcPr>
+            <w:tcW w:type="dxa" w:w="1426"/>
+          </w:tcPr>
+          <w:p>
+            <w:r>
+              <w:t>0.8064</w:t>
+            </w:r>
+          </w:p>
+        </w:tc>
+        <w:tc>
+          <w:tcPr>
+            <w:tcW w:type="dxa" w:w="1426"/>
+          </w:tcPr>
+          <w:p>
+            <w:r>
+              <w:t>0.2664</w:t>
+            </w:r>
+          </w:p>
+        </w:tc>
+        <w:tc>
+          <w:tcPr>
+            <w:tcW w:type="dxa" w:w="1426"/>
+          </w:tcPr>
+          <w:p>
+            <w:r>
+              <w:t>0.8872</w:t>
+            </w:r>
+          </w:p>
+        </w:tc>
+        <w:tc>
+          <w:tcPr>
+            <w:tcW w:type="dxa" w:w="1426"/>
+          </w:tcPr>
+          <w:p>
+            <w:r>
+              <w:t>0.8962</w:t>
+            </w:r>
+          </w:p>
+        </w:tc>
+        <w:tc>
+          <w:tcPr>
+            <w:tcW w:type="dxa" w:w="1426"/>
+          </w:tcPr>
+          <w:p>
+            <w:r>
+              <w:t>0.8536</w:t>
+            </w:r>
+          </w:p>
+        </w:tc>
+        <w:tc>
+          <w:tcPr>
+            <w:tcW w:type="dxa" w:w="1426"/>
+          </w:tcPr>
+          <w:p>
+            <w:r>
+              <w:t>0.9119</w:t>
+            </w:r>
+          </w:p>
+        </w:tc>
+        <w:tc>
+          <w:tcPr>
+            <w:tcW w:type="dxa" w:w="1426"/>
+          </w:tcPr>
+          <w:p>
+            <w:r>
+              <w:t>2610.8</w:t>
+            </w:r>
+          </w:p>
+        </w:tc>
+      </w:tr>
+      <w:tr>
+        <w:tc>
+          <w:tcPr>
+            <w:tcW w:type="dxa" w:w="1426"/>
+          </w:tcPr>
+          <w:p>
+            <w:r>
+              <w:t>5</w:t>
+            </w:r>
+          </w:p>
+        </w:tc>
+        <w:tc>
+          <w:tcPr>
+            <w:tcW w:type="dxa" w:w="1426"/>
+          </w:tcPr>
+          <w:p>
+            <w:r>
+              <w:t>8.55e-05</w:t>
+            </w:r>
+          </w:p>
+        </w:tc>
+        <w:tc>
+          <w:tcPr>
+            <w:tcW w:type="dxa" w:w="1426"/>
+          </w:tcPr>
+          <w:p>
+            <w:r>
+              <w:t>0.3197</w:t>
+            </w:r>
+          </w:p>
+        </w:tc>
+        <w:tc>
+          <w:tcPr>
+            <w:tcW w:type="dxa" w:w="1426"/>
+          </w:tcPr>
+          <w:p>
+            <w:r>
+              <w:t>0.8206</w:t>
+            </w:r>
+          </w:p>
+        </w:tc>
+        <w:tc>
+          <w:tcPr>
+            <w:tcW w:type="dxa" w:w="1426"/>
+          </w:tcPr>
+          <w:p>
+            <w:r>
+              <w:t>0.2571</w:t>
+            </w:r>
+          </w:p>
+        </w:tc>
+        <w:tc>
+          <w:tcPr>
+            <w:tcW w:type="dxa" w:w="1426"/>
+          </w:tcPr>
+          <w:p>
+            <w:r>
+              <w:t>0.8881</w:t>
+            </w:r>
+          </w:p>
+        </w:tc>
+        <w:tc>
+          <w:tcPr>
+            <w:tcW w:type="dxa" w:w="1426"/>
+          </w:tcPr>
+          <w:p>
+            <w:r>
+              <w:t>0.8843</w:t>
+            </w:r>
+          </w:p>
+        </w:tc>
+        <w:tc>
+          <w:tcPr>
+            <w:tcW w:type="dxa" w:w="1426"/>
+          </w:tcPr>
+          <w:p>
+            <w:r>
+              <w:t>0.8493</w:t>
+            </w:r>
+          </w:p>
+        </w:tc>
+        <w:tc>
+          <w:tcPr>
+            <w:tcW w:type="dxa" w:w="1426"/>
+          </w:tcPr>
+          <w:p>
+            <w:r>
+              <w:t>0.9307</w:t>
+            </w:r>
+          </w:p>
+        </w:tc>
+        <w:tc>
+          <w:tcPr>
+            <w:tcW w:type="dxa" w:w="1426"/>
+          </w:tcPr>
+          <w:p>
+            <w:r>
+              <w:t>2541.9</w:t>
+            </w:r>
+          </w:p>
+        </w:tc>
+      </w:tr>
+      <w:tr>
+        <w:tc>
+          <w:tcPr>
+            <w:tcW w:type="dxa" w:w="1426"/>
+          </w:tcPr>
+          <w:p>
+            <w:r>
+              <w:t>6</w:t>
+            </w:r>
+          </w:p>
+        </w:tc>
+        <w:tc>
+          <w:tcPr>
+            <w:tcW w:type="dxa" w:w="1426"/>
+          </w:tcPr>
+          <w:p>
+            <w:r>
+              <w:t>7.96e-05</w:t>
+            </w:r>
+          </w:p>
+        </w:tc>
+        <w:tc>
+          <w:tcPr>
+            <w:tcW w:type="dxa" w:w="1426"/>
+          </w:tcPr>
+          <w:p>
+            <w:r>
+              <w:t>0.3063</w:t>
+            </w:r>
+          </w:p>
+        </w:tc>
+        <w:tc>
+          <w:tcPr>
+            <w:tcW w:type="dxa" w:w="1426"/>
+          </w:tcPr>
+          <w:p>
+            <w:r>
+              <w:t>0.8468</w:t>
+            </w:r>
+          </w:p>
+        </w:tc>
+        <w:tc>
+          <w:tcPr>
+            <w:tcW w:type="dxa" w:w="1426"/>
+          </w:tcPr>
+          <w:p>
+            <w:r>
+              <w:t>0.2617</w:t>
+            </w:r>
+          </w:p>
+        </w:tc>
+        <w:tc>
+          <w:tcPr>
+            <w:tcW w:type="dxa" w:w="1426"/>
+          </w:tcPr>
+          <w:p>
+            <w:r>
+              <w:t>0.8939</w:t>
+            </w:r>
+          </w:p>
+        </w:tc>
+        <w:tc>
+          <w:tcPr>
+            <w:tcW w:type="dxa" w:w="1426"/>
+          </w:tcPr>
+          <w:p>
+            <w:r>
+              <w:t>0.8916</w:t>
+            </w:r>
+          </w:p>
+        </w:tc>
+        <w:tc>
+          <w:tcPr>
+            <w:tcW w:type="dxa" w:w="1426"/>
+          </w:tcPr>
+          <w:p>
+            <w:r>
+              <w:t>0.8504</w:t>
+            </w:r>
+          </w:p>
+        </w:tc>
+        <w:tc>
+          <w:tcPr>
+            <w:tcW w:type="dxa" w:w="1426"/>
+          </w:tcPr>
+          <w:p>
+            <w:r>
+              <w:t>0.9396</w:t>
+            </w:r>
+          </w:p>
+        </w:tc>
+        <w:tc>
+          <w:tcPr>
+            <w:tcW w:type="dxa" w:w="1426"/>
+          </w:tcPr>
+          <w:p>
+            <w:r>
+              <w:t>2546.1</w:t>
+            </w:r>
+          </w:p>
+        </w:tc>
+      </w:tr>
+      <w:tr>
+        <w:tc>
+          <w:tcPr>
+            <w:tcW w:type="dxa" w:w="1426"/>
+          </w:tcPr>
+          <w:p>
+            <w:r>
+              <w:t>7</w:t>
+            </w:r>
+          </w:p>
+        </w:tc>
+        <w:tc>
+          <w:tcPr>
+            <w:tcW w:type="dxa" w:w="1426"/>
+          </w:tcPr>
+          <w:p>
+            <w:r>
+              <w:t>7.30e-05</w:t>
+            </w:r>
+          </w:p>
+        </w:tc>
+        <w:tc>
+          <w:tcPr>
+            <w:tcW w:type="dxa" w:w="1426"/>
+          </w:tcPr>
+          <w:p>
+            <w:r>
+              <w:t>0.294</w:t>
+            </w:r>
+          </w:p>
+        </w:tc>
+        <w:tc>
+          <w:tcPr>
+            <w:tcW w:type="dxa" w:w="1426"/>
+          </w:tcPr>
+          <w:p>
+            <w:r>
+              <w:t>0.8541</w:t>
+            </w:r>
+          </w:p>
+        </w:tc>
+        <w:tc>
+          <w:tcPr>
+            <w:tcW w:type="dxa" w:w="1426"/>
+          </w:tcPr>
+          <w:p>
+            <w:r>
+              <w:t>0.2515</w:t>
+            </w:r>
+          </w:p>
+        </w:tc>
+        <w:tc>
+          <w:tcPr>
+            <w:tcW w:type="dxa" w:w="1426"/>
+          </w:tcPr>
+          <w:p>
+            <w:r>
+              <w:t>0.8915</w:t>
+            </w:r>
+          </w:p>
+        </w:tc>
+        <w:tc>
+          <w:tcPr>
+            <w:tcW w:type="dxa" w:w="1426"/>
+          </w:tcPr>
+          <w:p>
+            <w:r>
+              <w:t>0.8822</w:t>
+            </w:r>
+          </w:p>
+        </w:tc>
+        <w:tc>
+          <w:tcPr>
+            <w:tcW w:type="dxa" w:w="1426"/>
+          </w:tcPr>
+          <w:p>
+            <w:r>
+              <w:t>0.8506</w:t>
+            </w:r>
+          </w:p>
+        </w:tc>
+        <w:tc>
+          <w:tcPr>
+            <w:tcW w:type="dxa" w:w="1426"/>
+          </w:tcPr>
+          <w:p>
+            <w:r>
+              <w:t>0.9418</w:t>
+            </w:r>
+          </w:p>
+        </w:tc>
+        <w:tc>
+          <w:tcPr>
+            <w:tcW w:type="dxa" w:w="1426"/>
+          </w:tcPr>
+          <w:p>
+            <w:r>
+              <w:t>2538.6</w:t>
+            </w:r>
+          </w:p>
+        </w:tc>
+      </w:tr>
+      <w:tr>
+        <w:tc>
+          <w:tcPr>
+            <w:tcW w:type="dxa" w:w="1426"/>
+          </w:tcPr>
+          <w:p>
+            <w:r>
+              <w:t>8</w:t>
+            </w:r>
+          </w:p>
+        </w:tc>
+        <w:tc>
+          <w:tcPr>
+            <w:tcW w:type="dxa" w:w="1426"/>
+          </w:tcPr>
+          <w:p>
+            <w:r>
+              <w:t>6.58e-05</w:t>
+            </w:r>
+          </w:p>
+        </w:tc>
+        <w:tc>
+          <w:tcPr>
+            <w:tcW w:type="dxa" w:w="1426"/>
+          </w:tcPr>
+          <w:p>
+            <w:r>
+              <w:t>0.2835</w:t>
+            </w:r>
+          </w:p>
+        </w:tc>
+        <w:tc>
+          <w:tcPr>
+            <w:tcW w:type="dxa" w:w="1426"/>
+          </w:tcPr>
+          <w:p>
+            <w:r>
+              <w:t>0.8541</w:t>
+            </w:r>
+          </w:p>
+        </w:tc>
+        <w:tc>
+          <w:tcPr>
+            <w:tcW w:type="dxa" w:w="1426"/>
+          </w:tcPr>
+          <w:p>
+            <w:r>
+              <w:t>0.2481</w:t>
+            </w:r>
+          </w:p>
+        </w:tc>
+        <w:tc>
+          <w:tcPr>
+            <w:tcW w:type="dxa" w:w="1426"/>
+          </w:tcPr>
+          <w:p>
+            <w:r>
+              <w:t>0.9016</w:t>
+            </w:r>
+          </w:p>
+        </w:tc>
+        <w:tc>
+          <w:tcPr>
+            <w:tcW w:type="dxa" w:w="1426"/>
+          </w:tcPr>
+          <w:p>
+            <w:r>
+              <w:t>0.8964</w:t>
+            </w:r>
+          </w:p>
+        </w:tc>
+        <w:tc>
+          <w:tcPr>
+            <w:tcW w:type="dxa" w:w="1426"/>
+          </w:tcPr>
+          <w:p>
+            <w:r>
+              <w:t>0.8607</w:t>
+            </w:r>
+          </w:p>
+        </w:tc>
+        <w:tc>
+          <w:tcPr>
+            <w:tcW w:type="dxa" w:w="1426"/>
+          </w:tcPr>
+          <w:p>
+            <w:r>
+              <w:t>0.9476</w:t>
+            </w:r>
+          </w:p>
+        </w:tc>
+        <w:tc>
+          <w:tcPr>
+            <w:tcW w:type="dxa" w:w="1426"/>
+          </w:tcPr>
+          <w:p>
+            <w:r>
+              <w:t>2552.1</w:t>
+            </w:r>
+          </w:p>
+        </w:tc>
+      </w:tr>
+      <w:tr>
+        <w:tc>
+          <w:tcPr>
+            <w:tcW w:type="dxa" w:w="1426"/>
+          </w:tcPr>
+          <w:p>
+            <w:r>
+              <w:t>9</w:t>
+            </w:r>
+          </w:p>
+        </w:tc>
+        <w:tc>
+          <w:tcPr>
+            <w:tcW w:type="dxa" w:w="1426"/>
+          </w:tcPr>
+          <w:p>
+            <w:r>
+              <w:t>5.82e-05</w:t>
+            </w:r>
+          </w:p>
+        </w:tc>
+        <w:tc>
+          <w:tcPr>
+            <w:tcW w:type="dxa" w:w="1426"/>
+          </w:tcPr>
+          <w:p>
+            <w:r>
+              <w:t>0.2736</w:t>
+            </w:r>
+          </w:p>
+        </w:tc>
+        <w:tc>
+          <w:tcPr>
+            <w:tcW w:type="dxa" w:w="1426"/>
+          </w:tcPr>
+          <w:p>
+            <w:r>
+              <w:t>0.8789</w:t>
+            </w:r>
+          </w:p>
+        </w:tc>
+        <w:tc>
+          <w:tcPr>
+            <w:tcW w:type="dxa" w:w="1426"/>
+          </w:tcPr>
+          <w:p>
+            <w:r>
+              <w:t>0.2622</w:t>
+            </w:r>
+          </w:p>
+        </w:tc>
+        <w:tc>
+          <w:tcPr>
+            <w:tcW w:type="dxa" w:w="1426"/>
+          </w:tcPr>
+          <w:p>
+            <w:r>
+              <w:t>0.8975</w:t>
+            </w:r>
+          </w:p>
+        </w:tc>
+        <w:tc>
+          <w:tcPr>
+            <w:tcW w:type="dxa" w:w="1426"/>
+          </w:tcPr>
+          <w:p>
+            <w:r>
+              <w:t>0.8813</w:t>
+            </w:r>
+          </w:p>
+        </w:tc>
+        <w:tc>
+          <w:tcPr>
+            <w:tcW w:type="dxa" w:w="1426"/>
+          </w:tcPr>
+          <w:p>
+            <w:r>
+              <w:t>0.8662</w:t>
+            </w:r>
+          </w:p>
+        </w:tc>
+        <w:tc>
+          <w:tcPr>
+            <w:tcW w:type="dxa" w:w="1426"/>
+          </w:tcPr>
+          <w:p>
+            <w:r>
+              <w:t>0.9448</w:t>
+            </w:r>
+          </w:p>
+        </w:tc>
+        <w:tc>
+          <w:tcPr>
+            <w:tcW w:type="dxa" w:w="1426"/>
+          </w:tcPr>
+          <w:p>
+            <w:r>
+              <w:t>2542.5</w:t>
+            </w:r>
+          </w:p>
+        </w:tc>
+      </w:tr>
+      <w:tr>
+        <w:tc>
+          <w:tcPr>
+            <w:tcW w:type="dxa" w:w="1426"/>
+          </w:tcPr>
+          <w:p>
+            <w:r>
+              <w:t>10</w:t>
+            </w:r>
+          </w:p>
+        </w:tc>
+        <w:tc>
+          <w:tcPr>
+            <w:tcW w:type="dxa" w:w="1426"/>
+          </w:tcPr>
+          <w:p>
+            <w:r>
+              <w:t>5.05e-05</w:t>
+            </w:r>
+          </w:p>
+        </w:tc>
+        <w:tc>
+          <w:tcPr>
+            <w:tcW w:type="dxa" w:w="1426"/>
+          </w:tcPr>
+          <w:p>
+            <w:r>
+              <w:t>0.269</w:t>
+            </w:r>
+          </w:p>
+        </w:tc>
+        <w:tc>
+          <w:tcPr>
+            <w:tcW w:type="dxa" w:w="1426"/>
+          </w:tcPr>
+          <w:p>
+            <w:r>
+              <w:t>0.8814</w:t>
+            </w:r>
+          </w:p>
+        </w:tc>
+        <w:tc>
+          <w:tcPr>
+            <w:tcW w:type="dxa" w:w="1426"/>
+          </w:tcPr>
+          <w:p>
+            <w:r>
+              <w:t>0.237</w:t>
+            </w:r>
+          </w:p>
+        </w:tc>
+        <w:tc>
+          <w:tcPr>
+            <w:tcW w:type="dxa" w:w="1426"/>
+          </w:tcPr>
+          <w:p>
+            <w:r>
+              <w:t>0.8973</w:t>
+            </w:r>
+          </w:p>
+        </w:tc>
+        <w:tc>
+          <w:tcPr>
+            <w:tcW w:type="dxa" w:w="1426"/>
+          </w:tcPr>
+          <w:p>
+            <w:r>
+              <w:t>0.8941</w:t>
+            </w:r>
+          </w:p>
+        </w:tc>
+        <w:tc>
+          <w:tcPr>
+            <w:tcW w:type="dxa" w:w="1426"/>
+          </w:tcPr>
+          <w:p>
+            <w:r>
+              <w:t>0.8576</w:t>
+            </w:r>
+          </w:p>
+        </w:tc>
+        <w:tc>
+          <w:tcPr>
+            <w:tcW w:type="dxa" w:w="1426"/>
+          </w:tcPr>
+          <w:p>
+            <w:r>
+              <w:t>0.9401</w:t>
+            </w:r>
+          </w:p>
+        </w:tc>
+        <w:tc>
+          <w:tcPr>
+            <w:tcW w:type="dxa" w:w="1426"/>
+          </w:tcPr>
+          <w:p>
+            <w:r>
+              <w:t>2550.1</w:t>
+            </w:r>
+          </w:p>
+        </w:tc>
+      </w:tr>
+      <w:tr>
+        <w:tc>
+          <w:tcPr>
+            <w:tcW w:type="dxa" w:w="1426"/>
+          </w:tcPr>
+          <w:p>
+            <w:r>
+              <w:t>11</w:t>
+            </w:r>
+          </w:p>
+        </w:tc>
+        <w:tc>
+          <w:tcPr>
+            <w:tcW w:type="dxa" w:w="1426"/>
+          </w:tcPr>
+          <w:p>
+            <w:r>
+              <w:t>4.28e-05</w:t>
+            </w:r>
+          </w:p>
+        </w:tc>
+        <w:tc>
+          <w:tcPr>
+            <w:tcW w:type="dxa" w:w="1426"/>
+          </w:tcPr>
+          <w:p>
+            <w:r>
+              <w:t>0.2622</w:t>
+            </w:r>
+          </w:p>
+        </w:tc>
+        <w:tc>
+          <w:tcPr>
+            <w:tcW w:type="dxa" w:w="1426"/>
+          </w:tcPr>
+          <w:p>
+            <w:r>
+              <w:t>0.8805</w:t>
+            </w:r>
+          </w:p>
+        </w:tc>
+        <w:tc>
+          <w:tcPr>
+            <w:tcW w:type="dxa" w:w="1426"/>
+          </w:tcPr>
+          <w:p>
+            <w:r>
+              <w:t>0.2586</w:t>
+            </w:r>
+          </w:p>
+        </w:tc>
+        <w:tc>
+          <w:tcPr>
+            <w:tcW w:type="dxa" w:w="1426"/>
+          </w:tcPr>
+          <w:p>
+            <w:r>
+              <w:t>0.8998</w:t>
+            </w:r>
+          </w:p>
+        </w:tc>
+        <w:tc>
+          <w:tcPr>
+            <w:tcW w:type="dxa" w:w="1426"/>
+          </w:tcPr>
+          <w:p>
+            <w:r>
+              <w:t>0.8991</w:t>
+            </w:r>
+          </w:p>
+        </w:tc>
+        <w:tc>
+          <w:tcPr>
+            <w:tcW w:type="dxa" w:w="1426"/>
+          </w:tcPr>
+          <w:p>
+            <w:r>
+              <w:t>0.8639</w:t>
+            </w:r>
+          </w:p>
+        </w:tc>
+        <w:tc>
+          <w:tcPr>
+            <w:tcW w:type="dxa" w:w="1426"/>
+          </w:tcPr>
+          <w:p>
+            <w:r>
+              <w:t>0.9363</w:t>
+            </w:r>
+          </w:p>
+        </w:tc>
+        <w:tc>
+          <w:tcPr>
+            <w:tcW w:type="dxa" w:w="1426"/>
+          </w:tcPr>
+          <w:p>
+            <w:r>
+              <w:t>2551.4</w:t>
+            </w:r>
+          </w:p>
+        </w:tc>
+      </w:tr>
+      <w:tr>
+        <w:tc>
+          <w:tcPr>
+            <w:tcW w:type="dxa" w:w="1426"/>
+          </w:tcPr>
+          <w:p>
+            <w:r>
+              <w:t>12</w:t>
+            </w:r>
+          </w:p>
+        </w:tc>
+        <w:tc>
+          <w:tcPr>
+            <w:tcW w:type="dxa" w:w="1426"/>
+          </w:tcPr>
+          <w:p>
+            <w:r>
+              <w:t>3.52e-05</w:t>
+            </w:r>
+          </w:p>
+        </w:tc>
+        <w:tc>
+          <w:tcPr>
+            <w:tcW w:type="dxa" w:w="1426"/>
+          </w:tcPr>
+          <w:p>
+            <w:r>
+              <w:t>0.2522</w:t>
+            </w:r>
+          </w:p>
+        </w:tc>
+        <w:tc>
+          <w:tcPr>
+            <w:tcW w:type="dxa" w:w="1426"/>
+          </w:tcPr>
+          <w:p>
+            <w:r>
+              <w:t>0.8892</w:t>
+            </w:r>
+          </w:p>
+        </w:tc>
+        <w:tc>
+          <w:tcPr>
+            <w:tcW w:type="dxa" w:w="1426"/>
+          </w:tcPr>
+          <w:p>
+            <w:r>
+              <w:t>0.2633</w:t>
+            </w:r>
+          </w:p>
+        </w:tc>
+        <w:tc>
+          <w:tcPr>
+            <w:tcW w:type="dxa" w:w="1426"/>
+          </w:tcPr>
+          <w:p>
+            <w:r>
+              <w:t>0.9058</w:t>
+            </w:r>
+          </w:p>
+        </w:tc>
+        <w:tc>
+          <w:tcPr>
+            <w:tcW w:type="dxa" w:w="1426"/>
+          </w:tcPr>
+          <w:p>
+            <w:r>
+              <w:t>0.9001</w:t>
+            </w:r>
+          </w:p>
+        </w:tc>
+        <w:tc>
+          <w:tcPr>
+            <w:tcW w:type="dxa" w:w="1426"/>
+          </w:tcPr>
+          <w:p>
+            <w:r>
+              <w:t>0.8715</w:t>
+            </w:r>
+          </w:p>
+        </w:tc>
+        <w:tc>
+          <w:tcPr>
+            <w:tcW w:type="dxa" w:w="1426"/>
+          </w:tcPr>
+          <w:p>
+            <w:r>
+              <w:t>0.946</w:t>
+            </w:r>
+          </w:p>
+        </w:tc>
+        <w:tc>
+          <w:tcPr>
+            <w:tcW w:type="dxa" w:w="1426"/>
+          </w:tcPr>
+          <w:p>
+            <w:r>
+              <w:t>2540.7</w:t>
+            </w:r>
+          </w:p>
+        </w:tc>
+      </w:tr>
+      <w:tr>
+        <w:tc>
+          <w:tcPr>
+            <w:tcW w:type="dxa" w:w="1426"/>
+          </w:tcPr>
+          <w:p>
+            <w:r>
+              <w:t>13</w:t>
+            </w:r>
+          </w:p>
+        </w:tc>
+        <w:tc>
+          <w:tcPr>
+            <w:tcW w:type="dxa" w:w="1426"/>
+          </w:tcPr>
+          <w:p>
+            <w:r>
+              <w:t>2.80e-05</w:t>
+            </w:r>
+          </w:p>
+        </w:tc>
+        <w:tc>
+          <w:tcPr>
+            <w:tcW w:type="dxa" w:w="1426"/>
+          </w:tcPr>
+          <w:p>
+            <w:r>
+              <w:t>0.2479</w:t>
+            </w:r>
+          </w:p>
+        </w:tc>
+        <w:tc>
+          <w:tcPr>
+            <w:tcW w:type="dxa" w:w="1426"/>
+          </w:tcPr>
+          <w:p>
+            <w:r>
+              <w:t>0.9034</w:t>
+            </w:r>
+          </w:p>
+        </w:tc>
+        <w:tc>
+          <w:tcPr>
+            <w:tcW w:type="dxa" w:w="1426"/>
+          </w:tcPr>
+          <w:p>
+            <w:r>
+              <w:t>0.2685</w:t>
+            </w:r>
+          </w:p>
+        </w:tc>
+        <w:tc>
+          <w:tcPr>
+            <w:tcW w:type="dxa" w:w="1426"/>
+          </w:tcPr>
+          <w:p>
+            <w:r>
+              <w:t>0.911</w:t>
+            </w:r>
+          </w:p>
+        </w:tc>
+        <w:tc>
+          <w:tcPr>
+            <w:tcW w:type="dxa" w:w="1426"/>
+          </w:tcPr>
+          <w:p>
+            <w:r>
+              <w:t>0.9041</w:t>
+            </w:r>
+          </w:p>
+        </w:tc>
+        <w:tc>
+          <w:tcPr>
+            <w:tcW w:type="dxa" w:w="1426"/>
+          </w:tcPr>
+          <w:p>
+            <w:r>
+              <w:t>0.8789</w:t>
+            </w:r>
+          </w:p>
+        </w:tc>
+        <w:tc>
+          <w:tcPr>
+            <w:tcW w:type="dxa" w:w="1426"/>
+          </w:tcPr>
+          <w:p>
+            <w:r>
+              <w:t>0.9499</w:t>
+            </w:r>
+          </w:p>
+        </w:tc>
+        <w:tc>
+          <w:tcPr>
+            <w:tcW w:type="dxa" w:w="1426"/>
+          </w:tcPr>
+          <w:p>
+            <w:r>
+              <w:t>2524.2</w:t>
+            </w:r>
+          </w:p>
+        </w:tc>
+      </w:tr>
+      <w:tr>
+        <w:tc>
+          <w:tcPr>
+            <w:tcW w:type="dxa" w:w="1426"/>
+          </w:tcPr>
+          <w:p>
+            <w:r>
+              <w:t>14</w:t>
+            </w:r>
+          </w:p>
+        </w:tc>
+        <w:tc>
+          <w:tcPr>
+            <w:tcW w:type="dxa" w:w="1426"/>
+          </w:tcPr>
+          <w:p>
+            <w:r>
+              <w:t>2.14e-05</w:t>
+            </w:r>
+          </w:p>
+        </w:tc>
+        <w:tc>
+          <w:tcPr>
+            <w:tcW w:type="dxa" w:w="1426"/>
+          </w:tcPr>
+          <w:p>
+            <w:r>
+              <w:t>0.2425</w:t>
+            </w:r>
+          </w:p>
+        </w:tc>
+        <w:tc>
+          <w:tcPr>
+            <w:tcW w:type="dxa" w:w="1426"/>
+          </w:tcPr>
+          <w:p>
+            <w:r>
+              <w:t>0.9119</w:t>
+            </w:r>
+          </w:p>
+        </w:tc>
+        <w:tc>
+          <w:tcPr>
+            <w:tcW w:type="dxa" w:w="1426"/>
+          </w:tcPr>
+          <w:p>
+            <w:r>
+              <w:t>0.2569</w:t>
+            </w:r>
+          </w:p>
+        </w:tc>
+        <w:tc>
+          <w:tcPr>
+            <w:tcW w:type="dxa" w:w="1426"/>
+          </w:tcPr>
+          <w:p>
+            <w:r>
+              <w:t>0.9058</w:t>
+            </w:r>
+          </w:p>
+        </w:tc>
+        <w:tc>
+          <w:tcPr>
+            <w:tcW w:type="dxa" w:w="1426"/>
+          </w:tcPr>
+          <w:p>
+            <w:r>
+              <w:t>0.8997</w:t>
+            </w:r>
+          </w:p>
+        </w:tc>
+        <w:tc>
+          <w:tcPr>
+            <w:tcW w:type="dxa" w:w="1426"/>
+          </w:tcPr>
+          <w:p>
+            <w:r>
+              <w:t>0.877</w:t>
+            </w:r>
+          </w:p>
+        </w:tc>
+        <w:tc>
+          <w:tcPr>
+            <w:tcW w:type="dxa" w:w="1426"/>
+          </w:tcPr>
+          <w:p>
+            <w:r>
+              <w:t>0.9406</w:t>
+            </w:r>
+          </w:p>
+        </w:tc>
+        <w:tc>
+          <w:tcPr>
+            <w:tcW w:type="dxa" w:w="1426"/>
+          </w:tcPr>
+          <w:p>
+            <w:r>
+              <w:t>2522.9</w:t>
+            </w:r>
+          </w:p>
+        </w:tc>
+      </w:tr>
+      <w:tr>
+        <w:tc>
+          <w:tcPr>
+            <w:tcW w:type="dxa" w:w="1426"/>
+          </w:tcPr>
+          <w:p>
+            <w:r>
+              <w:t>15</w:t>
+            </w:r>
+          </w:p>
+        </w:tc>
+        <w:tc>
+          <w:tcPr>
+            <w:tcW w:type="dxa" w:w="1426"/>
+          </w:tcPr>
+          <w:p>
+            <w:r>
+              <w:t>1.55e-05</w:t>
+            </w:r>
+          </w:p>
+        </w:tc>
+        <w:tc>
+          <w:tcPr>
+            <w:tcW w:type="dxa" w:w="1426"/>
+          </w:tcPr>
+          <w:p>
+            <w:r>
+              <w:t>0.2368</w:t>
+            </w:r>
+          </w:p>
+        </w:tc>
+        <w:tc>
+          <w:tcPr>
+            <w:tcW w:type="dxa" w:w="1426"/>
+          </w:tcPr>
+          <w:p>
+            <w:r>
+              <w:t>0.9163</w:t>
+            </w:r>
+          </w:p>
+        </w:tc>
+        <w:tc>
+          <w:tcPr>
+            <w:tcW w:type="dxa" w:w="1426"/>
+          </w:tcPr>
+          <w:p>
+            <w:r>
+              <w:t>0.2566</w:t>
+            </w:r>
+          </w:p>
+        </w:tc>
+        <w:tc>
+          <w:tcPr>
+            <w:tcW w:type="dxa" w:w="1426"/>
+          </w:tcPr>
+          <w:p>
+            <w:r>
+              <w:t>0.9081</w:t>
+            </w:r>
+          </w:p>
+        </w:tc>
+        <w:tc>
+          <w:tcPr>
+            <w:tcW w:type="dxa" w:w="1426"/>
+          </w:tcPr>
+          <w:p>
+            <w:r>
+              <w:t>0.901</w:t>
+            </w:r>
+          </w:p>
+        </w:tc>
+        <w:tc>
+          <w:tcPr>
+            <w:tcW w:type="dxa" w:w="1426"/>
+          </w:tcPr>
+          <w:p>
+            <w:r>
+              <w:t>0.8775</w:t>
+            </w:r>
+          </w:p>
+        </w:tc>
+        <w:tc>
+          <w:tcPr>
+            <w:tcW w:type="dxa" w:w="1426"/>
+          </w:tcPr>
+          <w:p>
+            <w:r>
+              <w:t>0.9459</w:t>
+            </w:r>
+          </w:p>
+        </w:tc>
+        <w:tc>
+          <w:tcPr>
+            <w:tcW w:type="dxa" w:w="1426"/>
+          </w:tcPr>
+          <w:p>
+            <w:r>
+              <w:t>2539.4</w:t>
+            </w:r>
+          </w:p>
+        </w:tc>
+      </w:tr>
+      <w:tr>
+        <w:tc>
+          <w:tcPr>
+            <w:tcW w:type="dxa" w:w="1426"/>
+          </w:tcPr>
+          <w:p>
+            <w:r>
+              <w:t>16</w:t>
+            </w:r>
+          </w:p>
+        </w:tc>
+        <w:tc>
+          <w:tcPr>
+            <w:tcW w:type="dxa" w:w="1426"/>
+          </w:tcPr>
+          <w:p>
+            <w:r>
+              <w:t>1.05e-05</w:t>
+            </w:r>
+          </w:p>
+        </w:tc>
+        <w:tc>
+          <w:tcPr>
+            <w:tcW w:type="dxa" w:w="1426"/>
+          </w:tcPr>
+          <w:p>
+            <w:r>
+              <w:t>0.2331</w:t>
+            </w:r>
+          </w:p>
+        </w:tc>
+        <w:tc>
+          <w:tcPr>
+            <w:tcW w:type="dxa" w:w="1426"/>
+          </w:tcPr>
+          <w:p>
+            <w:r>
+              <w:t>0.9215</w:t>
+            </w:r>
+          </w:p>
+        </w:tc>
+        <w:tc>
+          <w:tcPr>
+            <w:tcW w:type="dxa" w:w="1426"/>
+          </w:tcPr>
+          <w:p>
+            <w:r>
+              <w:t>0.2619</w:t>
+            </w:r>
+          </w:p>
+        </w:tc>
+        <w:tc>
+          <w:tcPr>
+            <w:tcW w:type="dxa" w:w="1426"/>
+          </w:tcPr>
+          <w:p>
+            <w:r>
+              <w:t>0.9090</w:t>
+            </w:r>
+          </w:p>
+        </w:tc>
+        <w:tc>
+          <w:tcPr>
+            <w:tcW w:type="dxa" w:w="1426"/>
+          </w:tcPr>
+          <w:p>
+            <w:r>
+              <w:t>0.9010</w:t>
+            </w:r>
+          </w:p>
+        </w:tc>
+        <w:tc>
+          <w:tcPr>
+            <w:tcW w:type="dxa" w:w="1426"/>
+          </w:tcPr>
+          <w:p>
+            <w:r>
+              <w:t>0.8804</w:t>
+            </w:r>
+          </w:p>
+        </w:tc>
+        <w:tc>
+          <w:tcPr>
+            <w:tcW w:type="dxa" w:w="1426"/>
+          </w:tcPr>
+          <w:p>
+            <w:r>
+              <w:t>0.9457</w:t>
+            </w:r>
+          </w:p>
+        </w:tc>
+        <w:tc>
+          <w:tcPr>
+            <w:tcW w:type="dxa" w:w="1426"/>
+          </w:tcPr>
+          <w:p>
+            <w:r>
+              <w:t>2735.9</w:t>
+            </w:r>
+          </w:p>
+        </w:tc>
+      </w:tr>
+      <w:tr>
+        <w:tc>
+          <w:tcPr>
+            <w:tcW w:type="dxa" w:w="1426"/>
+          </w:tcPr>
+          <w:p>
+            <w:r>
+              <w:t>17</w:t>
+            </w:r>
+          </w:p>
+        </w:tc>
+        <w:tc>
+          <w:tcPr>
+            <w:tcW w:type="dxa" w:w="1426"/>
+          </w:tcPr>
+          <w:p>
+            <w:r>
+              <w:t>6.40e-06</w:t>
+            </w:r>
+          </w:p>
+        </w:tc>
+        <w:tc>
+          <w:tcPr>
+            <w:tcW w:type="dxa" w:w="1426"/>
+          </w:tcPr>
+          <w:p>
+            <w:r>
+              <w:t>0.2309</w:t>
+            </w:r>
+          </w:p>
+        </w:tc>
+        <w:tc>
+          <w:tcPr>
+            <w:tcW w:type="dxa" w:w="1426"/>
+          </w:tcPr>
+          <w:p>
+            <w:r>
+              <w:t>0.9236</w:t>
+            </w:r>
+          </w:p>
+        </w:tc>
+        <w:tc>
+          <w:tcPr>
+            <w:tcW w:type="dxa" w:w="1426"/>
+          </w:tcPr>
+          <w:p>
+            <w:r>
+              <w:t>0.2574</w:t>
+            </w:r>
+          </w:p>
+        </w:tc>
+        <w:tc>
+          <w:tcPr>
+            <w:tcW w:type="dxa" w:w="1426"/>
+          </w:tcPr>
+          <w:p>
+            <w:r>
+              <w:t>0.9111</w:t>
+            </w:r>
+          </w:p>
+        </w:tc>
+        <w:tc>
+          <w:tcPr>
+            <w:tcW w:type="dxa" w:w="1426"/>
+          </w:tcPr>
+          <w:p>
+            <w:r>
+              <w:t>0.9016</w:t>
+            </w:r>
+          </w:p>
+        </w:tc>
+        <w:tc>
+          <w:tcPr>
+            <w:tcW w:type="dxa" w:w="1426"/>
+          </w:tcPr>
+          <w:p>
+            <w:r>
+              <w:t>0.8837</w:t>
+            </w:r>
+          </w:p>
+        </w:tc>
+        <w:tc>
+          <w:tcPr>
+            <w:tcW w:type="dxa" w:w="1426"/>
+          </w:tcPr>
+          <w:p>
+            <w:r>
+              <w:t>0.9481</w:t>
+            </w:r>
+          </w:p>
+        </w:tc>
+        <w:tc>
+          <w:tcPr>
+            <w:tcW w:type="dxa" w:w="1426"/>
+          </w:tcPr>
+          <w:p>
+            <w:r>
+              <w:t>2661.4</w:t>
+            </w:r>
+          </w:p>
+        </w:tc>
+      </w:tr>
+      <w:tr>
+        <w:tc>
+          <w:tcPr>
+            <w:tcW w:type="dxa" w:w="1426"/>
+          </w:tcPr>
+          <w:p>
+            <w:r>
+              <w:t>18</w:t>
+            </w:r>
+          </w:p>
+        </w:tc>
+        <w:tc>
+          <w:tcPr>
+            <w:tcW w:type="dxa" w:w="1426"/>
+          </w:tcPr>
+          <w:p>
+            <w:r>
+              <w:t>3.42e-06</w:t>
+            </w:r>
+          </w:p>
+        </w:tc>
+        <w:tc>
+          <w:tcPr>
+            <w:tcW w:type="dxa" w:w="1426"/>
+          </w:tcPr>
+          <w:p>
+            <w:r>
+              <w:t>0.2285</w:t>
+            </w:r>
+          </w:p>
+        </w:tc>
+        <w:tc>
+          <w:tcPr>
+            <w:tcW w:type="dxa" w:w="1426"/>
+          </w:tcPr>
+          <w:p>
+            <w:r>
+              <w:t>0.9266</w:t>
+            </w:r>
+          </w:p>
+        </w:tc>
+        <w:tc>
+          <w:tcPr>
+            <w:tcW w:type="dxa" w:w="1426"/>
+          </w:tcPr>
+          <w:p>
+            <w:r>
+              <w:t>0.2550</w:t>
+            </w:r>
+          </w:p>
+        </w:tc>
+        <w:tc>
+          <w:tcPr>
+            <w:tcW w:type="dxa" w:w="1426"/>
+          </w:tcPr>
+          <w:p>
+            <w:r>
+              <w:t>0.9104</w:t>
+            </w:r>
+          </w:p>
+        </w:tc>
+        <w:tc>
+          <w:tcPr>
+            <w:tcW w:type="dxa" w:w="1426"/>
+          </w:tcPr>
+          <w:p>
+            <w:r>
+              <w:t>0.9011</w:t>
+            </w:r>
+          </w:p>
+        </w:tc>
+        <w:tc>
+          <w:tcPr>
+            <w:tcW w:type="dxa" w:w="1426"/>
+          </w:tcPr>
+          <w:p>
+            <w:r>
+              <w:t>0.8812</w:t>
+            </w:r>
+          </w:p>
+        </w:tc>
+        <w:tc>
+          <w:tcPr>
+            <w:tcW w:type="dxa" w:w="1426"/>
+          </w:tcPr>
+          <w:p>
+            <w:r>
+              <w:t>0.9489</w:t>
+            </w:r>
+          </w:p>
+        </w:tc>
+        <w:tc>
+          <w:tcPr>
+            <w:tcW w:type="dxa" w:w="1426"/>
+          </w:tcPr>
+          <w:p>
+            <w:r>
+              <w:t>2662.0</w:t>
+            </w:r>
+          </w:p>
+        </w:tc>
+      </w:tr>
+      <w:tr>
+        <w:tc>
+          <w:tcPr>
+            <w:tcW w:type="dxa" w:w="1426"/>
+          </w:tcPr>
+          <w:p>
+            <w:r>
+              <w:t>19</w:t>
+            </w:r>
+          </w:p>
+        </w:tc>
+        <w:tc>
+          <w:tcPr>
+            <w:tcW w:type="dxa" w:w="1426"/>
+          </w:tcPr>
+          <w:p>
+            <w:r>
+              <w:t>1.61e-06</w:t>
+            </w:r>
+          </w:p>
+        </w:tc>
+        <w:tc>
+          <w:tcPr>
+            <w:tcW w:type="dxa" w:w="1426"/>
+          </w:tcPr>
+          <w:p>
+            <w:r>
+              <w:t>0.2254</w:t>
+            </w:r>
+          </w:p>
+        </w:tc>
+        <w:tc>
+          <w:tcPr>
+            <w:tcW w:type="dxa" w:w="1426"/>
+          </w:tcPr>
+          <w:p>
+            <w:r>
+              <w:t>0.9274</w:t>
+            </w:r>
+          </w:p>
+        </w:tc>
+        <w:tc>
+          <w:tcPr>
+            <w:tcW w:type="dxa" w:w="1426"/>
+          </w:tcPr>
+          <w:p>
+            <w:r>
+              <w:t>0.2535</w:t>
+            </w:r>
+          </w:p>
+        </w:tc>
+        <w:tc>
+          <w:tcPr>
+            <w:tcW w:type="dxa" w:w="1426"/>
+          </w:tcPr>
+          <w:p>
+            <w:r>
+              <w:t>0.9106</w:t>
+            </w:r>
+          </w:p>
+        </w:tc>
+        <w:tc>
+          <w:tcPr>
+            <w:tcW w:type="dxa" w:w="1426"/>
+          </w:tcPr>
+          <w:p>
+            <w:r>
+              <w:t>0.9015</w:t>
+            </w:r>
+          </w:p>
+        </w:tc>
+        <w:tc>
+          <w:tcPr>
+            <w:tcW w:type="dxa" w:w="1426"/>
+          </w:tcPr>
+          <w:p>
+            <w:r>
+              <w:t>0.8829</w:t>
+            </w:r>
+          </w:p>
+        </w:tc>
+        <w:tc>
+          <w:tcPr>
+            <w:tcW w:type="dxa" w:w="1426"/>
+          </w:tcPr>
+          <w:p>
+            <w:r>
+              <w:t>0.9475</w:t>
+            </w:r>
+          </w:p>
+        </w:tc>
+        <w:tc>
+          <w:tcPr>
+            <w:tcW w:type="dxa" w:w="1426"/>
+          </w:tcPr>
+          <w:p>
+            <w:r>
+              <w:t>2649.4</w:t>
+            </w:r>
+          </w:p>
+        </w:tc>
+      </w:tr>
+      <w:tr>
+        <w:tc>
+          <w:tcPr>
+            <w:tcW w:type="dxa" w:w="1426"/>
+          </w:tcPr>
+          <w:p>
+            <w:r>
+              <w:t>20</w:t>
+            </w:r>
+          </w:p>
+        </w:tc>
+        <w:tc>
+          <w:tcPr>
+            <w:tcW w:type="dxa" w:w="1426"/>
+          </w:tcPr>
+          <w:p>
+            <w:r>
+              <w:t>1.00e-06</w:t>
+            </w:r>
+          </w:p>
+        </w:tc>
+        <w:tc>
+          <w:tcPr>
+            <w:tcW w:type="dxa" w:w="1426"/>
+          </w:tcPr>
+          <w:p>
+            <w:r>
+              <w:t>0.2249</w:t>
+            </w:r>
+          </w:p>
+        </w:tc>
+        <w:tc>
+          <w:tcPr>
+            <w:tcW w:type="dxa" w:w="1426"/>
+          </w:tcPr>
+          <w:p>
+            <w:r>
+              <w:t>0.9277</w:t>
+            </w:r>
+          </w:p>
+        </w:tc>
+        <w:tc>
+          <w:tcPr>
+            <w:tcW w:type="dxa" w:w="1426"/>
+          </w:tcPr>
+          <w:p>
+            <w:r>
+              <w:t>0.2533</w:t>
+            </w:r>
+          </w:p>
+        </w:tc>
+        <w:tc>
+          <w:tcPr>
+            <w:tcW w:type="dxa" w:w="1426"/>
+          </w:tcPr>
+          <w:p>
+            <w:r>
+              <w:t>0.9112</w:t>
+            </w:r>
+          </w:p>
+        </w:tc>
+        <w:tc>
+          <w:tcPr>
+            <w:tcW w:type="dxa" w:w="1426"/>
+          </w:tcPr>
+          <w:p>
+            <w:r>
+              <w:t>0.9015</w:t>
+            </w:r>
+          </w:p>
+        </w:tc>
+        <w:tc>
+          <w:tcPr>
+            <w:tcW w:type="dxa" w:w="1426"/>
+          </w:tcPr>
+          <w:p>
+            <w:r>
+              <w:t>0.8828</w:t>
+            </w:r>
+          </w:p>
+        </w:tc>
+        <w:tc>
+          <w:tcPr>
+            <w:tcW w:type="dxa" w:w="1426"/>
+          </w:tcPr>
+          <w:p>
+            <w:r>
+              <w:t>0.9494</w:t>
+            </w:r>
+          </w:p>
+        </w:tc>
+        <w:tc>
+          <w:tcPr>
+            <w:tcW w:type="dxa" w:w="1426"/>
+          </w:tcPr>
+          <w:p>
+            <w:r>
+              <w:t>2658.4</w:t>
+            </w:r>
+          </w:p>
+        </w:tc>
+      </w:tr>
+    </w:tbl>
+    <w:p>
+      <w:r>
+        <w:t>Source file: results/training_history_effnetb5_c_order_fold0.csv. The best validation Dice (0.9112) occurs at epoch 20. Per-class values are the training-style Dice (empty prediction and empty ground truth both count as Dice = 1).</w:t>
+      </w:r>
+    </w:p>
     <w:sectPr>
       <w:pgSz w:w="15840" w:h="12240" w:orient="landscape"/>
       <w:pgMar w:top="792" w:right="792" w:bottom="792" w:left="792" w:header="720" w:footer="720" w:gutter="0"/>

</xml_diff>